<commit_message>
docs(dissertation): align P6 description with citation-anchored PRISMA reframe (drop pending-formal-search framing)
</commit_message>
<xml_diff>
--- a/dist/luan_an_ctu/chuong_3_phuong_phap_vi.docx
+++ b/dist/luan_an_ctu/chuong_3_phuong_phap_vi.docx
@@ -284,10 +284,10 @@
           <w:bCs/>
           <w:b/>
         </w:rPr>
-        <w:t xml:space="preserve">Pool hiện tại</w:t>
-      </w:r>
-      <w:r>
-        <w:t xml:space="preserve">: K=288 effect sizes / k=238 nghiên cứu (baseline trước WoS+Scopus formal search); mục tiêu sau formal search: k≥250, tăng so với bản nền ICBEF 2025 (K=200 / k=113).</w:t>
+        <w:t xml:space="preserve">Tập tổng hợp</w:t>
+      </w:r>
+      <w:r>
+        <w:t xml:space="preserve">: K=288 effect sizes / k=238 nghiên cứu, được xây dựng theo chiến lược tìm kiếm hệ thống nhưng có giới hạn (citation-anchored: backward/forward citation từ 5 meta-analysis mỏ neo + bổ sung cơ sở dữ liệu), báo cáo theo biến thể PRISMA 2020 "studies identified via other methods"; mở rộng so với bản nền ICBEF 2025 (K=200 / k=113).</w:t>
       </w:r>
     </w:p>
     <w:p>
@@ -18019,10 +18019,7 @@
     </w:p>
     <w:bookmarkEnd w:id="58"/>
     <w:bookmarkEnd w:id="59"/>
-    <w:sectPr>
-      <w:pgSz w:h="16838" w:w="11906"/>
-      <w:pgMar w:bottom="1134" w:left="1701" w:right="1134" w:top="1134"/>
-    </w:sectPr>
+    <w:sectPr/>
   </w:body>
 </w:document>
 </file>
@@ -18258,59 +18255,29 @@
   <w:style w:default="1" w:styleId="Normal" w:type="paragraph">
     <w:name w:val="Normal"/>
     <w:qFormat/>
-    <w:pPr>
-      <w:spacing w:line="360" w:lineRule="auto"/>
-      <w:jc w:val="both"/>
-    </w:pPr>
-    <w:rPr>
-      <w:rFonts w:ascii="Times New Roman" w:eastAsia="Times New Roman" w:hAnsi="Times New Roman"/>
-      <w:color w:val="000000"/>
-      <w:sz w:val="26"/>
-    </w:rPr>
   </w:style>
   <w:style w:styleId="BodyText" w:type="paragraph">
     <w:name w:val="Body Text"/>
     <w:basedOn w:val="Normal"/>
     <w:link w:val="BodyTextChar"/>
     <w:pPr>
-      <w:spacing w:after="180" w:before="180" w:line="360" w:lineRule="auto"/>
-      <w:jc w:val="both"/>
+      <w:spacing w:after="180" w:before="180"/>
     </w:pPr>
     <w:qFormat/>
-    <w:rPr>
-      <w:rFonts w:ascii="Times New Roman" w:eastAsia="Times New Roman" w:hAnsi="Times New Roman"/>
-      <w:color w:val="000000"/>
-      <w:sz w:val="26"/>
-    </w:rPr>
   </w:style>
   <w:style w:customStyle="1" w:styleId="FirstParagraph" w:type="paragraph">
     <w:name w:val="First Paragraph"/>
     <w:basedOn w:val="BodyText"/>
     <w:next w:val="BodyText"/>
     <w:qFormat/>
-    <w:pPr>
-      <w:spacing w:line="360" w:lineRule="auto"/>
-      <w:jc w:val="both"/>
-    </w:pPr>
-    <w:rPr>
-      <w:rFonts w:ascii="Times New Roman" w:eastAsia="Times New Roman" w:hAnsi="Times New Roman"/>
-      <w:color w:val="000000"/>
-      <w:sz w:val="26"/>
-    </w:rPr>
   </w:style>
   <w:style w:customStyle="1" w:styleId="Compact" w:type="paragraph">
     <w:name w:val="Compact"/>
     <w:basedOn w:val="BodyText"/>
     <w:qFormat/>
     <w:pPr>
-      <w:spacing w:after="36" w:before="36" w:line="360" w:lineRule="auto"/>
-      <w:jc w:val="both"/>
+      <w:spacing w:after="36" w:before="36"/>
     </w:pPr>
-    <w:rPr>
-      <w:rFonts w:ascii="Times New Roman" w:eastAsia="Times New Roman" w:hAnsi="Times New Roman"/>
-      <w:color w:val="000000"/>
-      <w:sz w:val="26"/>
-    </w:rPr>
   </w:style>
   <w:style w:styleId="Title" w:type="paragraph">
     <w:name w:val="Title"/>
@@ -18320,15 +18287,15 @@
     <w:pPr>
       <w:keepNext/>
       <w:keepLines/>
-      <w:spacing w:after="240" w:before="480" w:line="360" w:lineRule="auto"/>
-      <w:jc w:val="both"/>
+      <w:spacing w:after="240" w:before="480"/>
+      <w:jc w:val="center"/>
     </w:pPr>
     <w:rPr>
-      <w:rFonts w:ascii="Times New Roman" w:asciiTheme="majorHAnsi" w:cstheme="majorBidi" w:eastAsia="Times New Roman" w:eastAsiaTheme="majorEastAsia" w:hAnsi="Times New Roman" w:hAnsiTheme="majorHAnsi"/>
+      <w:rFonts w:asciiTheme="majorHAnsi" w:cstheme="majorBidi" w:eastAsiaTheme="majorEastAsia" w:hAnsiTheme="majorHAnsi"/>
       <w:b/>
       <w:bCs/>
-      <w:color w:val="000000"/>
-      <w:sz w:val="26"/>
+      <w:color w:themeColor="accent1" w:themeShade="B5" w:val="345A8A"/>
+      <w:sz w:val="36"/>
       <w:szCs w:val="36"/>
     </w:rPr>
   </w:style>
@@ -18340,13 +18307,11 @@
     <w:pPr>
       <w:keepNext/>
       <w:keepLines/>
-      <w:spacing w:after="240" w:before="240" w:line="360" w:lineRule="auto"/>
-      <w:jc w:val="both"/>
+      <w:spacing w:after="240" w:before="240"/>
+      <w:jc w:val="center"/>
     </w:pPr>
     <w:rPr>
-      <w:rFonts w:ascii="Times New Roman" w:eastAsia="Times New Roman" w:hAnsi="Times New Roman"/>
-      <w:color w:val="000000"/>
-      <w:sz w:val="26"/>
+      <w:sz w:val="30"/>
       <w:szCs w:val="30"/>
     </w:rPr>
   </w:style>
@@ -18357,14 +18322,8 @@
     <w:pPr>
       <w:keepNext/>
       <w:keepLines/>
-      <w:spacing w:line="360" w:lineRule="auto"/>
-      <w:jc w:val="both"/>
+      <w:jc w:val="center"/>
     </w:pPr>
-    <w:rPr>
-      <w:rFonts w:ascii="Times New Roman" w:eastAsia="Times New Roman" w:hAnsi="Times New Roman"/>
-      <w:color w:val="000000"/>
-      <w:sz w:val="26"/>
-    </w:rPr>
   </w:style>
   <w:style w:styleId="Date" w:type="paragraph">
     <w:name w:val="Date"/>
@@ -18373,14 +18332,8 @@
     <w:pPr>
       <w:keepNext/>
       <w:keepLines/>
-      <w:spacing w:line="360" w:lineRule="auto"/>
-      <w:jc w:val="both"/>
+      <w:jc w:val="center"/>
     </w:pPr>
-    <w:rPr>
-      <w:rFonts w:ascii="Times New Roman" w:eastAsia="Times New Roman" w:hAnsi="Times New Roman"/>
-      <w:color w:val="000000"/>
-      <w:sz w:val="26"/>
-    </w:rPr>
   </w:style>
   <w:style w:customStyle="1" w:styleId="AbstractTitle" w:type="paragraph">
     <w:name w:val="Abstract Title"/>
@@ -18390,15 +18343,15 @@
     <w:pPr>
       <w:keepNext/>
       <w:keepLines/>
-      <w:jc w:val="both"/>
-      <w:spacing w:after="0" w:before="300" w:line="360" w:lineRule="auto"/>
+      <w:jc w:val="center"/>
+      <w:spacing w:after="0" w:before="300"/>
     </w:pPr>
     <w:rPr>
-      <w:color w:val="000000"/>
-      <w:sz w:val="26"/>
+      <w:sz w:val="20"/>
       <w:szCs w:val="20"/>
-      <w:rFonts w:ascii="Times New Roman" w:eastAsia="Times New Roman" w:hAnsi="Times New Roman"/>
       <w:b/>
+      <w:color w:val="345A8A"/>
+      &gt;
     </w:rPr>
   </w:style>
   <w:style w:customStyle="1" w:styleId="Abstract" w:type="paragraph">
@@ -18409,13 +18362,10 @@
     <w:pPr>
       <w:keepNext/>
       <w:keepLines/>
-      <w:spacing w:after="300" w:before="100" w:line="360" w:lineRule="auto"/>
-      <w:jc w:val="both"/>
+      <w:spacing w:after="300" w:before="100"/>
     </w:pPr>
     <w:rPr>
-      <w:rFonts w:ascii="Times New Roman" w:eastAsia="Times New Roman" w:hAnsi="Times New Roman"/>
-      <w:color w:val="000000"/>
-      <w:sz w:val="26"/>
+      <w:sz w:val="20"/>
       <w:szCs w:val="20"/>
     </w:rPr>
   </w:style>
@@ -18424,15 +18374,8 @@
     <w:basedOn w:val="Normal"/>
     <w:next w:val="Bibliography"/>
     <w:qFormat/>
-    <w:pPr>
-      <w:spacing w:line="360" w:lineRule="auto"/>
-      <w:jc w:val="both"/>
-    </w:pPr>
-    <w:rPr>
-      <w:rFonts w:ascii="Times New Roman" w:eastAsia="Times New Roman" w:hAnsi="Times New Roman"/>
-      <w:color w:val="000000"/>
-      <w:sz w:val="26"/>
-    </w:rPr>
+    <w:pPr/>
+    <w:rPr/>
   </w:style>
   <w:style w:styleId="Heading1" w:type="paragraph">
     <w:name w:val="Heading 1"/>
@@ -18443,16 +18386,15 @@
     <w:pPr>
       <w:keepNext/>
       <w:keepLines/>
-      <w:spacing w:after="0" w:before="480" w:line="360" w:lineRule="auto"/>
-      <w:jc w:val="both"/>
+      <w:spacing w:after="0" w:before="480"/>
       <w:outlineLvl w:val="0"/>
     </w:pPr>
     <w:rPr>
-      <w:rFonts w:ascii="Times New Roman" w:asciiTheme="majorHAnsi" w:cstheme="majorBidi" w:eastAsia="Times New Roman" w:eastAsiaTheme="majorEastAsia" w:hAnsi="Times New Roman" w:hAnsiTheme="majorHAnsi"/>
+      <w:rFonts w:asciiTheme="majorHAnsi" w:cstheme="majorBidi" w:eastAsiaTheme="majorEastAsia" w:hAnsiTheme="majorHAnsi"/>
       <w:b/>
       <w:bCs/>
-      <w:color w:val="000000"/>
-      <w:sz w:val="26"/>
+      <w:color w:themeColor="accent1" w:val="4F81BD"/>
+      <w:sz w:val="32"/>
       <w:szCs w:val="32"/>
     </w:rPr>
   </w:style>
@@ -18466,16 +18408,15 @@
     <w:pPr>
       <w:keepNext/>
       <w:keepLines/>
-      <w:spacing w:after="0" w:before="200" w:line="360" w:lineRule="auto"/>
-      <w:jc w:val="both"/>
+      <w:spacing w:after="0" w:before="200"/>
       <w:outlineLvl w:val="1"/>
     </w:pPr>
     <w:rPr>
-      <w:rFonts w:ascii="Times New Roman" w:asciiTheme="majorHAnsi" w:cstheme="majorBidi" w:eastAsia="Times New Roman" w:eastAsiaTheme="majorEastAsia" w:hAnsi="Times New Roman" w:hAnsiTheme="majorHAnsi"/>
+      <w:rFonts w:asciiTheme="majorHAnsi" w:cstheme="majorBidi" w:eastAsiaTheme="majorEastAsia" w:hAnsiTheme="majorHAnsi"/>
       <w:b/>
       <w:bCs/>
-      <w:color w:val="000000"/>
-      <w:sz w:val="26"/>
+      <w:color w:themeColor="accent1" w:val="4F81BD"/>
+      <w:sz w:val="28"/>
       <w:szCs w:val="28"/>
     </w:rPr>
   </w:style>
@@ -18489,16 +18430,15 @@
     <w:pPr>
       <w:keepNext/>
       <w:keepLines/>
-      <w:spacing w:after="0" w:before="200" w:line="360" w:lineRule="auto"/>
-      <w:jc w:val="both"/>
+      <w:spacing w:after="0" w:before="200"/>
       <w:outlineLvl w:val="2"/>
     </w:pPr>
     <w:rPr>
-      <w:rFonts w:ascii="Times New Roman" w:asciiTheme="majorHAnsi" w:cstheme="majorBidi" w:eastAsia="Times New Roman" w:eastAsiaTheme="majorEastAsia" w:hAnsi="Times New Roman" w:hAnsiTheme="majorHAnsi"/>
+      <w:rFonts w:asciiTheme="majorHAnsi" w:cstheme="majorBidi" w:eastAsiaTheme="majorEastAsia" w:hAnsiTheme="majorHAnsi"/>
       <w:b/>
       <w:bCs/>
-      <w:color w:val="000000"/>
-      <w:sz w:val="26"/>
+      <w:color w:themeColor="accent1" w:val="4F81BD"/>
+      <w:sz w:val="24"/>
       <w:szCs w:val="24"/>
     </w:rPr>
   </w:style>
@@ -18512,16 +18452,15 @@
     <w:pPr>
       <w:keepNext/>
       <w:keepLines/>
-      <w:spacing w:after="0" w:before="200" w:line="360" w:lineRule="auto"/>
-      <w:jc w:val="both"/>
+      <w:spacing w:after="0" w:before="200"/>
       <w:outlineLvl w:val="3"/>
     </w:pPr>
     <w:rPr>
-      <w:rFonts w:ascii="Times New Roman" w:asciiTheme="majorHAnsi" w:cstheme="majorBidi" w:eastAsia="Times New Roman" w:eastAsiaTheme="majorEastAsia" w:hAnsi="Times New Roman" w:hAnsiTheme="majorHAnsi"/>
+      <w:rFonts w:asciiTheme="majorHAnsi" w:cstheme="majorBidi" w:eastAsiaTheme="majorEastAsia" w:hAnsiTheme="majorHAnsi"/>
       <w:i/>
       <w:bCs/>
-      <w:color w:val="000000"/>
-      <w:sz w:val="26"/>
+      <w:color w:themeColor="accent1" w:val="4F81BD"/>
+      <w:sz w:val="24"/>
       <w:szCs w:val="24"/>
     </w:rPr>
   </w:style>
@@ -18535,15 +18474,14 @@
     <w:pPr>
       <w:keepNext/>
       <w:keepLines/>
-      <w:spacing w:after="0" w:before="200" w:line="360" w:lineRule="auto"/>
-      <w:jc w:val="both"/>
+      <w:spacing w:after="0" w:before="200"/>
       <w:outlineLvl w:val="4"/>
     </w:pPr>
     <w:rPr>
-      <w:rFonts w:ascii="Times New Roman" w:asciiTheme="majorHAnsi" w:cstheme="majorBidi" w:eastAsia="Times New Roman" w:eastAsiaTheme="majorEastAsia" w:hAnsi="Times New Roman" w:hAnsiTheme="majorHAnsi"/>
+      <w:rFonts w:asciiTheme="majorHAnsi" w:cstheme="majorBidi" w:eastAsiaTheme="majorEastAsia" w:hAnsiTheme="majorHAnsi"/>
       <w:iCs/>
-      <w:color w:val="000000"/>
-      <w:sz w:val="26"/>
+      <w:color w:themeColor="accent1" w:val="4F81BD"/>
+      <w:sz w:val="24"/>
       <w:szCs w:val="24"/>
     </w:rPr>
   </w:style>
@@ -18557,14 +18495,13 @@
     <w:pPr>
       <w:keepNext/>
       <w:keepLines/>
-      <w:spacing w:after="0" w:before="200" w:line="360" w:lineRule="auto"/>
-      <w:jc w:val="both"/>
+      <w:spacing w:after="0" w:before="200"/>
       <w:outlineLvl w:val="5"/>
     </w:pPr>
     <w:rPr>
-      <w:rFonts w:ascii="Times New Roman" w:asciiTheme="majorHAnsi" w:cstheme="majorBidi" w:eastAsia="Times New Roman" w:eastAsiaTheme="majorEastAsia" w:hAnsi="Times New Roman" w:hAnsiTheme="majorHAnsi"/>
-      <w:color w:val="000000"/>
-      <w:sz w:val="26"/>
+      <w:rFonts w:asciiTheme="majorHAnsi" w:cstheme="majorBidi" w:eastAsiaTheme="majorEastAsia" w:hAnsiTheme="majorHAnsi"/>
+      <w:color w:themeColor="accent1" w:val="4F81BD"/>
+      <w:sz w:val="24"/>
       <w:szCs w:val="24"/>
     </w:rPr>
   </w:style>
@@ -18578,14 +18515,13 @@
     <w:pPr>
       <w:keepNext/>
       <w:keepLines/>
-      <w:spacing w:after="0" w:before="200" w:line="360" w:lineRule="auto"/>
-      <w:jc w:val="both"/>
+      <w:spacing w:after="0" w:before="200"/>
       <w:outlineLvl w:val="6"/>
     </w:pPr>
     <w:rPr>
-      <w:rFonts w:ascii="Times New Roman" w:asciiTheme="majorHAnsi" w:cstheme="majorBidi" w:eastAsia="Times New Roman" w:eastAsiaTheme="majorEastAsia" w:hAnsi="Times New Roman" w:hAnsiTheme="majorHAnsi"/>
-      <w:color w:val="000000"/>
-      <w:sz w:val="26"/>
+      <w:rFonts w:asciiTheme="majorHAnsi" w:cstheme="majorBidi" w:eastAsiaTheme="majorEastAsia" w:hAnsiTheme="majorHAnsi"/>
+      <w:color w:themeColor="accent1" w:val="4F81BD"/>
+      <w:sz w:val="24"/>
       <w:szCs w:val="24"/>
     </w:rPr>
   </w:style>
@@ -18599,14 +18535,13 @@
     <w:pPr>
       <w:keepNext/>
       <w:keepLines/>
-      <w:spacing w:after="0" w:before="200" w:line="360" w:lineRule="auto"/>
-      <w:jc w:val="both"/>
+      <w:spacing w:after="0" w:before="200"/>
       <w:outlineLvl w:val="7"/>
     </w:pPr>
     <w:rPr>
-      <w:rFonts w:ascii="Times New Roman" w:asciiTheme="majorHAnsi" w:cstheme="majorBidi" w:eastAsia="Times New Roman" w:eastAsiaTheme="majorEastAsia" w:hAnsi="Times New Roman" w:hAnsiTheme="majorHAnsi"/>
-      <w:color w:val="000000"/>
-      <w:sz w:val="26"/>
+      <w:rFonts w:asciiTheme="majorHAnsi" w:cstheme="majorBidi" w:eastAsiaTheme="majorEastAsia" w:hAnsiTheme="majorHAnsi"/>
+      <w:color w:themeColor="accent1" w:val="4F81BD"/>
+      <w:sz w:val="24"/>
       <w:szCs w:val="24"/>
     </w:rPr>
   </w:style>
@@ -18620,14 +18555,13 @@
     <w:pPr>
       <w:keepNext/>
       <w:keepLines/>
-      <w:spacing w:after="0" w:before="200" w:line="360" w:lineRule="auto"/>
-      <w:jc w:val="both"/>
+      <w:spacing w:after="0" w:before="200"/>
       <w:outlineLvl w:val="8"/>
     </w:pPr>
     <w:rPr>
-      <w:rFonts w:ascii="Times New Roman" w:asciiTheme="majorHAnsi" w:cstheme="majorBidi" w:eastAsia="Times New Roman" w:eastAsiaTheme="majorEastAsia" w:hAnsi="Times New Roman" w:hAnsiTheme="majorHAnsi"/>
-      <w:color w:val="000000"/>
-      <w:sz w:val="26"/>
+      <w:rFonts w:asciiTheme="majorHAnsi" w:cstheme="majorBidi" w:eastAsiaTheme="majorEastAsia" w:hAnsiTheme="majorHAnsi"/>
+      <w:color w:themeColor="accent1" w:val="4F81BD"/>
+      <w:sz w:val="24"/>
       <w:szCs w:val="24"/>
     </w:rPr>
   </w:style>
@@ -18639,15 +18573,9 @@
     <w:unhideWhenUsed/>
     <w:qFormat/>
     <w:pPr>
-      <w:spacing w:after="100" w:before="100" w:line="360" w:lineRule="auto"/>
+      <w:spacing w:after="100" w:before="100"/>
       <w:ind w:firstLine="0" w:left="480" w:right="480"/>
-      <w:jc w:val="both"/>
     </w:pPr>
-    <w:rPr>
-      <w:rFonts w:ascii="Times New Roman" w:eastAsia="Times New Roman" w:hAnsi="Times New Roman"/>
-      <w:color w:val="000000"/>
-      <w:sz w:val="26"/>
-    </w:rPr>
   </w:style>
   <w:style w:styleId="FootnoteText" w:type="paragraph">
     <w:name w:val="Footnote Text"/>
@@ -18656,25 +18584,11 @@
     <w:uiPriority w:val="9"/>
     <w:unhideWhenUsed/>
     <w:qFormat/>
-    <w:pPr>
-      <w:spacing w:line="360" w:lineRule="auto"/>
-      <w:jc w:val="both"/>
-    </w:pPr>
-    <w:rPr>
-      <w:rFonts w:ascii="Times New Roman" w:eastAsia="Times New Roman" w:hAnsi="Times New Roman"/>
-      <w:color w:val="000000"/>
-      <w:sz w:val="26"/>
-    </w:rPr>
   </w:style>
   <w:style w:default="1" w:styleId="DefaultParagraphFont" w:type="character">
     <w:name w:val="Default Paragraph Font"/>
     <w:semiHidden/>
     <w:unhideWhenUsed/>
-    <w:rPr>
-      <w:rFonts w:ascii="Times New Roman" w:eastAsia="Times New Roman" w:hAnsi="Times New Roman"/>
-      <w:color w:val="000000"/>
-      <w:sz w:val="26"/>
-    </w:rPr>
   </w:style>
   <w:style w:default="1" w:styleId="Table" w:type="table">
     <w:name w:val="Table"/>
@@ -18682,15 +18596,6 @@
     <w:semiHidden/>
     <w:unhideWhenUsed/>
     <w:qFormat/>
-    <w:pPr>
-      <w:spacing w:line="360" w:lineRule="auto"/>
-      <w:jc w:val="both"/>
-    </w:pPr>
-    <w:rPr>
-      <w:rFonts w:ascii="Times New Roman" w:eastAsia="Times New Roman" w:hAnsi="Times New Roman"/>
-      <w:color w:val="000000"/>
-      <w:sz w:val="26"/>
-    </w:rPr>
     <w:tblPr>
       <w:tblInd w:type="dxa" w:w="0"/>
       <w:tblCellMar>
@@ -18723,42 +18628,25 @@
     <w:pPr>
       <w:keepNext/>
       <w:keepLines/>
-      <w:spacing w:after="0" w:line="360" w:lineRule="auto"/>
-      <w:jc w:val="both"/>
+      <w:spacing w:after="0"/>
     </w:pPr>
     <w:rPr>
-      <w:rFonts w:ascii="Times New Roman" w:eastAsia="Times New Roman" w:hAnsi="Times New Roman"/>
       <w:b/>
-      <w:color w:val="000000"/>
-      <w:sz w:val="26"/>
     </w:rPr>
   </w:style>
   <w:style w:customStyle="1" w:styleId="Definition" w:type="paragraph">
     <w:name w:val="Definition"/>
     <w:basedOn w:val="Normal"/>
-    <w:pPr>
-      <w:spacing w:line="360" w:lineRule="auto"/>
-      <w:jc w:val="both"/>
-    </w:pPr>
-    <w:rPr>
-      <w:rFonts w:ascii="Times New Roman" w:eastAsia="Times New Roman" w:hAnsi="Times New Roman"/>
-      <w:color w:val="000000"/>
-      <w:sz w:val="26"/>
-    </w:rPr>
   </w:style>
   <w:style w:styleId="Caption" w:type="paragraph">
     <w:name w:val="Caption"/>
     <w:basedOn w:val="Normal"/>
     <w:link w:val="BodyTextChar"/>
     <w:pPr>
-      <w:spacing w:after="120" w:before="0" w:line="360" w:lineRule="auto"/>
-      <w:jc w:val="both"/>
+      <w:spacing w:after="120" w:before="0"/>
     </w:pPr>
     <w:rPr>
-      <w:rFonts w:ascii="Times New Roman" w:eastAsia="Times New Roman" w:hAnsi="Times New Roman"/>
       <w:i/>
-      <w:color w:val="000000"/>
-      <w:sz w:val="26"/>
     </w:rPr>
   </w:style>
   <w:style w:customStyle="1" w:styleId="TableCaption" w:type="paragraph">
@@ -18766,90 +18654,44 @@
     <w:basedOn w:val="Caption"/>
     <w:pPr>
       <w:keepNext/>
-      <w:spacing w:line="360" w:lineRule="auto"/>
-      <w:jc w:val="both"/>
     </w:pPr>
-    <w:rPr>
-      <w:rFonts w:ascii="Times New Roman" w:eastAsia="Times New Roman" w:hAnsi="Times New Roman"/>
-      <w:color w:val="000000"/>
-      <w:sz w:val="26"/>
-    </w:rPr>
   </w:style>
   <w:style w:customStyle="1" w:styleId="ImageCaption" w:type="paragraph">
     <w:name w:val="Image Caption"/>
     <w:basedOn w:val="Caption"/>
-    <w:pPr>
-      <w:spacing w:line="360" w:lineRule="auto"/>
-      <w:jc w:val="both"/>
-    </w:pPr>
-    <w:rPr>
-      <w:rFonts w:ascii="Times New Roman" w:eastAsia="Times New Roman" w:hAnsi="Times New Roman"/>
-      <w:color w:val="000000"/>
-      <w:sz w:val="26"/>
-    </w:rPr>
   </w:style>
   <w:style w:customStyle="1" w:styleId="Figure" w:type="paragraph">
     <w:name w:val="Figure"/>
     <w:basedOn w:val="Normal"/>
-    <w:pPr>
-      <w:spacing w:line="360" w:lineRule="auto"/>
-      <w:jc w:val="both"/>
-    </w:pPr>
-    <w:rPr>
-      <w:rFonts w:ascii="Times New Roman" w:eastAsia="Times New Roman" w:hAnsi="Times New Roman"/>
-      <w:color w:val="000000"/>
-      <w:sz w:val="26"/>
-    </w:rPr>
   </w:style>
   <w:style w:customStyle="1" w:styleId="CaptionedFigure" w:type="paragraph">
     <w:name w:val="Captioned Figure"/>
     <w:basedOn w:val="Figure"/>
     <w:pPr>
       <w:keepNext/>
-      <w:spacing w:line="360" w:lineRule="auto"/>
-      <w:jc w:val="both"/>
     </w:pPr>
-    <w:rPr>
-      <w:rFonts w:ascii="Times New Roman" w:eastAsia="Times New Roman" w:hAnsi="Times New Roman"/>
-      <w:color w:val="000000"/>
-      <w:sz w:val="26"/>
-    </w:rPr>
   </w:style>
   <w:style w:customStyle="1" w:styleId="BodyTextChar" w:type="character">
     <w:name w:val="Body Text Char"/>
     <w:basedOn w:val="DefaultParagraphFont"/>
     <w:link w:val="BodyText"/>
-    <w:rPr>
-      <w:rFonts w:ascii="Times New Roman" w:eastAsia="Times New Roman" w:hAnsi="Times New Roman"/>
-      <w:color w:val="000000"/>
-      <w:sz w:val="26"/>
-    </w:rPr>
   </w:style>
   <w:style w:customStyle="1" w:styleId="VerbatimChar" w:type="character">
     <w:name w:val="Verbatim Char"/>
     <w:basedOn w:val="BodyTextChar"/>
     <w:rPr>
-      <w:rFonts w:ascii="Times New Roman" w:eastAsia="Times New Roman" w:hAnsi="Times New Roman"/>
-      <w:color w:val="000000"/>
-      <w:sz w:val="26"/>
+      <w:rFonts w:ascii="Consolas" w:hAnsi="Consolas"/>
+      <w:sz w:val="22"/>
     </w:rPr>
   </w:style>
   <w:style w:customStyle="1" w:styleId="SectionNumber" w:type="character">
     <w:name w:val="Section Number"/>
     <w:basedOn w:val="BodyTextChar"/>
-    <w:rPr>
-      <w:rFonts w:ascii="Times New Roman" w:eastAsia="Times New Roman" w:hAnsi="Times New Roman"/>
-      <w:color w:val="000000"/>
-      <w:sz w:val="26"/>
-    </w:rPr>
   </w:style>
   <w:style w:styleId="FootnoteReference" w:type="character">
     <w:name w:val="Footnote Reference"/>
     <w:basedOn w:val="BodyTextChar"/>
     <w:rPr>
-      <w:rFonts w:ascii="Times New Roman" w:eastAsia="Times New Roman" w:hAnsi="Times New Roman"/>
-      <w:color w:val="000000"/>
-      <w:sz w:val="26"/>
       <w:vertAlign w:val="superscript"/>
     </w:rPr>
   </w:style>
@@ -18857,9 +18699,7 @@
     <w:name w:val="Hyperlink"/>
     <w:basedOn w:val="BodyTextChar"/>
     <w:rPr>
-      <w:rFonts w:ascii="Times New Roman" w:eastAsia="Times New Roman" w:hAnsi="Times New Roman"/>
-      <w:color w:val="000000"/>
-      <w:sz w:val="26"/>
+      <w:color w:themeColor="accent1" w:val="4F81BD"/>
     </w:rPr>
   </w:style>
   <w:style w:styleId="TOCHeading" w:type="paragraph">
@@ -18870,16 +18710,14 @@
     <w:unhideWhenUsed/>
     <w:qFormat/>
     <w:pPr>
-      <w:spacing w:before="240" w:line="360" w:lineRule="auto"/>
-      <w:jc w:val="both"/>
+      <w:spacing w:before="240" w:line="259" w:lineRule="auto"/>
       <w:outlineLvl w:val="9"/>
     </w:pPr>
     <w:rPr>
-      <w:rFonts w:ascii="Times New Roman" w:asciiTheme="majorHAnsi" w:cstheme="majorBidi" w:eastAsia="Times New Roman" w:eastAsiaTheme="majorEastAsia" w:hAnsi="Times New Roman" w:hAnsiTheme="majorHAnsi"/>
+      <w:rFonts w:asciiTheme="majorHAnsi" w:cstheme="majorBidi" w:eastAsiaTheme="majorEastAsia" w:hAnsiTheme="majorHAnsi"/>
       <w:b w:val="0"/>
       <w:bCs w:val="0"/>
-      <w:color w:val="000000"/>
-      <w:sz w:val="26"/>
+      <w:color w:themeColor="accent1" w:themeShade="BF" w:val="365F91"/>
     </w:rPr>
   </w:style>
   <w:style w:type="paragraph" w:customStyle="1" w:styleId="SourceCode">

</xml_diff>

<commit_message>
fix(ch3): FP measurement consistency P3/P4/P5 vs P7 — conditional cross-country comparability
Audit grounded in manuscripts + Ch3 variable tables: P3/P4/P5/P7 all use the SAME
construct ln(LP)=ln(d2/l1). Currency handling differs BY DESIGN: single-country
studies (P3 VN +PPP across 2009-2023, P4 SG winsor 1/99, P5 CN D_2024 dummy) use
one national currency so raw levels compare within sample; multi-country P7
requires within country-year z + two-way FE (Appendix A A.5). §3.3.2 previously
claimed unconditional cross-country comparability — now states comparability is
CONDITIONAL (achieved through estimation design), removing apparent tension with
the Ch4/CD1 currency-artifact corrections. Linter clean; Ch3 docx regenerated.
</commit_message>
<xml_diff>
--- a/dist/luan_an_ctu/chuong_3_phuong_phap_vi.docx
+++ b/dist/luan_an_ctu/chuong_3_phuong_phap_vi.docx
@@ -622,7 +622,253 @@
         <w:t xml:space="preserve">Lập luận chọn</w:t>
       </w:r>
       <w:r>
-        <w:t xml:space="preserve">: WBES không phải bộ financial statement đầy đủ, nên labor productivity phù hợp hơn ROA/ROE/ROS trong bối cảnh đa quốc gia. Ngoài ra, labor productivity có tính so sánh xuyên quốc gia cao hơn do không bị ảnh hưởng bởi chuẩn mực kế toán khác biệt (Combs et al., 2005; Richard et al., 2009).</w:t>
+        <w:t xml:space="preserve">: WBES không phải bộ financial statement đầy đủ, nên labor productivity phù hợp hơn ROA/ROE/ROS trong bối cảnh đa quốc gia. Ngoài ra, labor productivity ít bị ảnh hưởng bởi chuẩn mực kế toán khác biệt giữa các nước hơn so với các chỉ tiêu kế toán (Combs et al., 2005; Richard et al., 2009).</w:t>
+      </w:r>
+    </w:p>
+    <w:p>
+      <w:pPr>
+        <w:pStyle w:val="BodyText"/>
+      </w:pPr>
+      <w:r>
+        <w:rPr>
+          <w:bCs/>
+          <w:b/>
+        </w:rPr>
+        <w:t xml:space="preserve">Nhất quán đo lường xuyên các nghiên cứu thành phần và điều kiện so sánh tiền tệ</w:t>
+      </w:r>
+      <w:r>
+        <w:t xml:space="preserve">: cùng một construct</w:t>
+      </w:r>
+      <w:r>
+        <w:t xml:space="preserve"> </w:t>
+      </w:r>
+      <m:oMath>
+        <m:r>
+          <m:rPr>
+            <m:sty m:val="p"/>
+          </m:rPr>
+          <m:t>ln</m:t>
+        </m:r>
+        <m:d>
+          <m:dPr>
+            <m:begChr m:val="("/>
+            <m:endChr m:val=")"/>
+            <m:sepChr m:val=""/>
+            <m:grow/>
+          </m:dPr>
+          <m:e>
+            <m:r>
+              <m:rPr>
+                <m:nor/>
+                <m:sty m:val="p"/>
+              </m:rPr>
+              <m:t>LP</m:t>
+            </m:r>
+          </m:e>
+        </m:d>
+      </m:oMath>
+      <w:r>
+        <w:t xml:space="preserve"> </w:t>
+      </w:r>
+      <w:r>
+        <w:t xml:space="preserve">từ trường WBES d2/l1 được dùng thống nhất ở P3, P4, P5 và P7, nhưng cách xử lý đơn vị tiền tệ khác nhau</w:t>
+      </w:r>
+      <w:r>
+        <w:t xml:space="preserve"> </w:t>
+      </w:r>
+      <w:r>
+        <w:rPr>
+          <w:bCs/>
+          <w:b/>
+        </w:rPr>
+        <w:t xml:space="preserve">theo đúng bản chất thiết kế</w:t>
+      </w:r>
+      <w:r>
+        <w:t xml:space="preserve"> </w:t>
+      </w:r>
+      <w:r>
+        <w:t xml:space="preserve">của từng nghiên cứu: (i) các nghiên cứu</w:t>
+      </w:r>
+      <w:r>
+        <w:t xml:space="preserve"> </w:t>
+      </w:r>
+      <w:r>
+        <w:rPr>
+          <w:bCs/>
+          <w:b/>
+        </w:rPr>
+        <w:t xml:space="preserve">đơn quốc gia</w:t>
+      </w:r>
+      <w:r>
+        <w:t xml:space="preserve"> </w:t>
+      </w:r>
+      <w:r>
+        <w:t xml:space="preserve">(P3 Việt Nam, P4 Singapore, P5 Trung Quốc, P9 Ấn Độ) đo doanh thu bằng</w:t>
+      </w:r>
+      <w:r>
+        <w:t xml:space="preserve"> </w:t>
+      </w:r>
+      <w:r>
+        <w:rPr>
+          <w:bCs/>
+          <w:b/>
+        </w:rPr>
+        <w:t xml:space="preserve">một nội tệ duy nhất</w:t>
+      </w:r>
+      <w:r>
+        <w:t xml:space="preserve"> </w:t>
+      </w:r>
+      <w:r>
+        <w:t xml:space="preserve">nên mức</w:t>
+      </w:r>
+      <w:r>
+        <w:t xml:space="preserve"> </w:t>
+      </w:r>
+      <m:oMath>
+        <m:r>
+          <m:rPr>
+            <m:sty m:val="p"/>
+          </m:rPr>
+          <m:t>ln</m:t>
+        </m:r>
+        <m:d>
+          <m:dPr>
+            <m:begChr m:val="("/>
+            <m:endChr m:val=")"/>
+            <m:sepChr m:val=""/>
+            <m:grow/>
+          </m:dPr>
+          <m:e>
+            <m:r>
+              <m:rPr>
+                <m:nor/>
+                <m:sty m:val="p"/>
+              </m:rPr>
+              <m:t>LP</m:t>
+            </m:r>
+          </m:e>
+        </m:d>
+      </m:oMath>
+      <w:r>
+        <w:t xml:space="preserve"> </w:t>
+      </w:r>
+      <w:r>
+        <w:t xml:space="preserve">so sánh được trực tiếp trong nội bộ mẫu; khác biệt mặt bằng giá giữa các đợt khảo sát được hấp thụ bằng biến giả đợt/hiệu ứng cố định năm (P5:</w:t>
+      </w:r>
+      <w:r>
+        <w:t xml:space="preserve"> </w:t>
+      </w:r>
+      <m:oMath>
+        <m:sSub>
+          <m:e>
+            <m:r>
+              <m:t>D</m:t>
+            </m:r>
+          </m:e>
+          <m:sub>
+            <m:r>
+              <m:t>2024</m:t>
+            </m:r>
+          </m:sub>
+        </m:sSub>
+      </m:oMath>
+      <w:r>
+        <w:t xml:space="preserve">; P3 bổ sung hiệu chỉnh PPP cho khoảng cách 14 năm 2009–2023), kèm winsorize 1%/99% (P4); (ii) nghiên cứu</w:t>
+      </w:r>
+      <w:r>
+        <w:t xml:space="preserve"> </w:t>
+      </w:r>
+      <w:r>
+        <w:rPr>
+          <w:bCs/>
+          <w:b/>
+        </w:rPr>
+        <w:t xml:space="preserve">đa quốc gia</w:t>
+      </w:r>
+      <w:r>
+        <w:t xml:space="preserve"> </w:t>
+      </w:r>
+      <w:r>
+        <w:t xml:space="preserve">(P7) gộp doanh thu bằng</w:t>
+      </w:r>
+      <w:r>
+        <w:t xml:space="preserve"> </w:t>
+      </w:r>
+      <w:r>
+        <w:rPr>
+          <w:bCs/>
+          <w:b/>
+        </w:rPr>
+        <w:t xml:space="preserve">nhiều nội tệ</w:t>
+      </w:r>
+      <w:r>
+        <w:t xml:space="preserve">, do đó mức</w:t>
+      </w:r>
+      <w:r>
+        <w:t xml:space="preserve"> </w:t>
+      </w:r>
+      <m:oMath>
+        <m:r>
+          <m:rPr>
+            <m:sty m:val="p"/>
+          </m:rPr>
+          <m:t>ln</m:t>
+        </m:r>
+        <m:d>
+          <m:dPr>
+            <m:begChr m:val="("/>
+            <m:endChr m:val=")"/>
+            <m:sepChr m:val=""/>
+            <m:grow/>
+          </m:dPr>
+          <m:e>
+            <m:r>
+              <m:rPr>
+                <m:nor/>
+                <m:sty m:val="p"/>
+              </m:rPr>
+              <m:t>LP</m:t>
+            </m:r>
+          </m:e>
+        </m:d>
+      </m:oMath>
+      <w:r>
+        <w:t xml:space="preserve"> </w:t>
+      </w:r>
+      <w:r>
+        <w:t xml:space="preserve">thô không so sánh được giữa các nước — tính so sánh được bảo đảm bằng chuẩn hóa z within country–year và hiệu ứng cố định hai chiều, như trình bày chi tiết ở Phụ lục A (§A.5); mọi so sánh</w:t>
+      </w:r>
+      <w:r>
+        <w:t xml:space="preserve"> </w:t>
+      </w:r>
+      <w:r>
+        <w:rPr>
+          <w:bCs/>
+          <w:b/>
+        </w:rPr>
+        <w:t xml:space="preserve">mức</w:t>
+      </w:r>
+      <w:r>
+        <w:t xml:space="preserve"> </w:t>
+      </w:r>
+      <w:r>
+        <w:t xml:space="preserve">xuyên quốc gia trong luận án dùng tỷ suất không thứ nguyên (ROS) hoặc giá trị đã hiệu chỉnh PPP. Như vậy tính so sánh xuyên quốc gia của thước đo là</w:t>
+      </w:r>
+      <w:r>
+        <w:t xml:space="preserve"> </w:t>
+      </w:r>
+      <w:r>
+        <w:rPr>
+          <w:bCs/>
+          <w:b/>
+        </w:rPr>
+        <w:t xml:space="preserve">có điều kiện</w:t>
+      </w:r>
+      <w:r>
+        <w:t xml:space="preserve"> </w:t>
+      </w:r>
+      <w:r>
+        <w:t xml:space="preserve">— đạt được qua thiết kế ước lượng, không phải tự động ở mức thô.</w:t>
       </w:r>
     </w:p>
     <w:p>

</xml_diff>